<commit_message>
Actualiza el equipo a cuatro integrantes
Retira a Choquehuanca Marrufo de la lista de integrantes, reparte sus
láminas del avance 2 entre los demás y regenera avance_2_ver_2.
</commit_message>
<xml_diff>
--- a/clase_entregables/avance_2_ver_2.docx
+++ b/clase_entregables/avance_2_ver_2.docx
@@ -243,14 +243,6 @@
               <w:spacing w:after="40" w:line="276" w:lineRule="auto"/>
             </w:pPr>
             <w:r>
-              <w:t>Choquehuanca Marrufo, Liam Lennon</w:t>
-            </w:r>
-          </w:p>
-          <w:p>
-            <w:pPr>
-              <w:spacing w:after="40" w:line="276" w:lineRule="auto"/>
-            </w:pPr>
-            <w:r>
               <w:t>Damián Valdivia, Diego Aarón</w:t>
             </w:r>
           </w:p>
@@ -334,7 +326,7 @@
       <w:pPr>
         <w:pStyle w:val="Ttulo1"/>
       </w:pPr>
-      <w:bookmarkStart w:id="0" w:name="_Toc242759050"/>
+      <w:bookmarkStart w:id="0" w:name="_Toc242898867"/>
       <w:r>
         <w:lastRenderedPageBreak/>
         <w:t>Índice</w:t>
@@ -367,7 +359,7 @@
       <w:r>
         <w:fldChar w:fldCharType="separate"/>
       </w:r>
-      <w:hyperlink w:anchor="_Toc242759050" w:history="1">
+      <w:hyperlink w:anchor="_Toc242898867" w:history="1">
         <w:r>
           <w:rPr>
             <w:rStyle w:val="Hipervnculo"/>
@@ -394,7 +386,7 @@
             <w:noProof/>
             <w:webHidden/>
           </w:rPr>
-          <w:instrText xml:space="preserve"> PAGEREF _Toc242759050 \h </w:instrText>
+          <w:instrText xml:space="preserve"> PAGEREF _Toc242898867 \h </w:instrText>
         </w:r>
         <w:r>
           <w:rPr>
@@ -442,7 +434,7 @@
           <w14:ligatures w14:val="standardContextual"/>
         </w:rPr>
       </w:pPr>
-      <w:hyperlink w:anchor="_Toc242759051" w:history="1">
+      <w:hyperlink w:anchor="_Toc242898868" w:history="1">
         <w:r>
           <w:rPr>
             <w:rStyle w:val="Hipervnculo"/>
@@ -469,7 +461,7 @@
             <w:noProof/>
             <w:webHidden/>
           </w:rPr>
-          <w:instrText xml:space="preserve"> PAGEREF _Toc242759051 \h </w:instrText>
+          <w:instrText xml:space="preserve"> PAGEREF _Toc242898868 \h </w:instrText>
         </w:r>
         <w:r>
           <w:rPr>
@@ -517,7 +509,7 @@
           <w14:ligatures w14:val="standardContextual"/>
         </w:rPr>
       </w:pPr>
-      <w:hyperlink w:anchor="_Toc242759052" w:history="1">
+      <w:hyperlink w:anchor="_Toc242898869" w:history="1">
         <w:r>
           <w:rPr>
             <w:rStyle w:val="Hipervnculo"/>
@@ -544,7 +536,7 @@
             <w:noProof/>
             <w:webHidden/>
           </w:rPr>
-          <w:instrText xml:space="preserve"> PAGEREF _Toc242759052 \h </w:instrText>
+          <w:instrText xml:space="preserve"> PAGEREF _Toc242898869 \h </w:instrText>
         </w:r>
         <w:r>
           <w:rPr>
@@ -592,7 +584,7 @@
           <w14:ligatures w14:val="standardContextual"/>
         </w:rPr>
       </w:pPr>
-      <w:hyperlink w:anchor="_Toc242759053" w:history="1">
+      <w:hyperlink w:anchor="_Toc242898870" w:history="1">
         <w:r>
           <w:rPr>
             <w:rStyle w:val="Hipervnculo"/>
@@ -619,7 +611,7 @@
             <w:noProof/>
             <w:webHidden/>
           </w:rPr>
-          <w:instrText xml:space="preserve"> PAGEREF _Toc242759053 \h </w:instrText>
+          <w:instrText xml:space="preserve"> PAGEREF _Toc242898870 \h </w:instrText>
         </w:r>
         <w:r>
           <w:rPr>
@@ -667,7 +659,7 @@
           <w14:ligatures w14:val="standardContextual"/>
         </w:rPr>
       </w:pPr>
-      <w:hyperlink w:anchor="_Toc242759054" w:history="1">
+      <w:hyperlink w:anchor="_Toc242898871" w:history="1">
         <w:r>
           <w:rPr>
             <w:rStyle w:val="Hipervnculo"/>
@@ -694,7 +686,7 @@
             <w:noProof/>
             <w:webHidden/>
           </w:rPr>
-          <w:instrText xml:space="preserve"> PAGEREF _Toc242759054 \h </w:instrText>
+          <w:instrText xml:space="preserve"> PAGEREF _Toc242898871 \h </w:instrText>
         </w:r>
         <w:r>
           <w:rPr>
@@ -742,7 +734,7 @@
           <w14:ligatures w14:val="standardContextual"/>
         </w:rPr>
       </w:pPr>
-      <w:hyperlink w:anchor="_Toc242759055" w:history="1">
+      <w:hyperlink w:anchor="_Toc242898872" w:history="1">
         <w:r>
           <w:rPr>
             <w:rStyle w:val="Hipervnculo"/>
@@ -769,7 +761,7 @@
             <w:noProof/>
             <w:webHidden/>
           </w:rPr>
-          <w:instrText xml:space="preserve"> PAGEREF _Toc242759055 \h </w:instrText>
+          <w:instrText xml:space="preserve"> PAGEREF _Toc242898872 \h </w:instrText>
         </w:r>
         <w:r>
           <w:rPr>
@@ -817,7 +809,7 @@
           <w14:ligatures w14:val="standardContextual"/>
         </w:rPr>
       </w:pPr>
-      <w:hyperlink w:anchor="_Toc242759056" w:history="1">
+      <w:hyperlink w:anchor="_Toc242898873" w:history="1">
         <w:r>
           <w:rPr>
             <w:rStyle w:val="Hipervnculo"/>
@@ -844,7 +836,7 @@
             <w:noProof/>
             <w:webHidden/>
           </w:rPr>
-          <w:instrText xml:space="preserve"> PAGEREF _Toc242759056 \h </w:instrText>
+          <w:instrText xml:space="preserve"> PAGEREF _Toc242898873 \h </w:instrText>
         </w:r>
         <w:r>
           <w:rPr>
@@ -892,7 +884,7 @@
           <w14:ligatures w14:val="standardContextual"/>
         </w:rPr>
       </w:pPr>
-      <w:hyperlink w:anchor="_Toc242759057" w:history="1">
+      <w:hyperlink w:anchor="_Toc242898874" w:history="1">
         <w:r>
           <w:rPr>
             <w:rStyle w:val="Hipervnculo"/>
@@ -919,7 +911,7 @@
             <w:noProof/>
             <w:webHidden/>
           </w:rPr>
-          <w:instrText xml:space="preserve"> PAGEREF _Toc242759057 \h </w:instrText>
+          <w:instrText xml:space="preserve"> PAGEREF _Toc242898874 \h </w:instrText>
         </w:r>
         <w:r>
           <w:rPr>
@@ -967,7 +959,7 @@
           <w14:ligatures w14:val="standardContextual"/>
         </w:rPr>
       </w:pPr>
-      <w:hyperlink w:anchor="_Toc242759058" w:history="1">
+      <w:hyperlink w:anchor="_Toc242898875" w:history="1">
         <w:r>
           <w:rPr>
             <w:rStyle w:val="Hipervnculo"/>
@@ -994,7 +986,7 @@
             <w:noProof/>
             <w:webHidden/>
           </w:rPr>
-          <w:instrText xml:space="preserve"> PAGEREF _Toc242759058 \h </w:instrText>
+          <w:instrText xml:space="preserve"> PAGEREF _Toc242898875 \h </w:instrText>
         </w:r>
         <w:r>
           <w:rPr>
@@ -1042,7 +1034,7 @@
           <w14:ligatures w14:val="standardContextual"/>
         </w:rPr>
       </w:pPr>
-      <w:hyperlink w:anchor="_Toc242759059" w:history="1">
+      <w:hyperlink w:anchor="_Toc242898876" w:history="1">
         <w:r>
           <w:rPr>
             <w:rStyle w:val="Hipervnculo"/>
@@ -1069,7 +1061,7 @@
             <w:noProof/>
             <w:webHidden/>
           </w:rPr>
-          <w:instrText xml:space="preserve"> PAGEREF _Toc242759059 \h </w:instrText>
+          <w:instrText xml:space="preserve"> PAGEREF _Toc242898876 \h </w:instrText>
         </w:r>
         <w:r>
           <w:rPr>
@@ -1117,7 +1109,7 @@
           <w14:ligatures w14:val="standardContextual"/>
         </w:rPr>
       </w:pPr>
-      <w:hyperlink w:anchor="_Toc242759060" w:history="1">
+      <w:hyperlink w:anchor="_Toc242898877" w:history="1">
         <w:r>
           <w:rPr>
             <w:rStyle w:val="Hipervnculo"/>
@@ -1144,7 +1136,7 @@
             <w:noProof/>
             <w:webHidden/>
           </w:rPr>
-          <w:instrText xml:space="preserve"> PAGEREF _Toc242759060 \h </w:instrText>
+          <w:instrText xml:space="preserve"> PAGEREF _Toc242898877 \h </w:instrText>
         </w:r>
         <w:r>
           <w:rPr>
@@ -1192,7 +1184,7 @@
           <w14:ligatures w14:val="standardContextual"/>
         </w:rPr>
       </w:pPr>
-      <w:hyperlink w:anchor="_Toc242759061" w:history="1">
+      <w:hyperlink w:anchor="_Toc242898878" w:history="1">
         <w:r>
           <w:rPr>
             <w:rStyle w:val="Hipervnculo"/>
@@ -1219,7 +1211,7 @@
             <w:noProof/>
             <w:webHidden/>
           </w:rPr>
-          <w:instrText xml:space="preserve"> PAGEREF _Toc242759061 \h </w:instrText>
+          <w:instrText xml:space="preserve"> PAGEREF _Toc242898878 \h </w:instrText>
         </w:r>
         <w:r>
           <w:rPr>
@@ -1267,7 +1259,7 @@
           <w14:ligatures w14:val="standardContextual"/>
         </w:rPr>
       </w:pPr>
-      <w:hyperlink w:anchor="_Toc242759062" w:history="1">
+      <w:hyperlink w:anchor="_Toc242898879" w:history="1">
         <w:r>
           <w:rPr>
             <w:rStyle w:val="Hipervnculo"/>
@@ -1294,7 +1286,7 @@
             <w:noProof/>
             <w:webHidden/>
           </w:rPr>
-          <w:instrText xml:space="preserve"> PAGEREF _Toc242759062 \h </w:instrText>
+          <w:instrText xml:space="preserve"> PAGEREF _Toc242898879 \h </w:instrText>
         </w:r>
         <w:r>
           <w:rPr>
@@ -1342,7 +1334,7 @@
           <w14:ligatures w14:val="standardContextual"/>
         </w:rPr>
       </w:pPr>
-      <w:hyperlink w:anchor="_Toc242759063" w:history="1">
+      <w:hyperlink w:anchor="_Toc242898880" w:history="1">
         <w:r>
           <w:rPr>
             <w:rStyle w:val="Hipervnculo"/>
@@ -1369,7 +1361,7 @@
             <w:noProof/>
             <w:webHidden/>
           </w:rPr>
-          <w:instrText xml:space="preserve"> PAGEREF _Toc242759063 \h </w:instrText>
+          <w:instrText xml:space="preserve"> PAGEREF _Toc242898880 \h </w:instrText>
         </w:r>
         <w:r>
           <w:rPr>
@@ -1417,7 +1409,7 @@
           <w14:ligatures w14:val="standardContextual"/>
         </w:rPr>
       </w:pPr>
-      <w:hyperlink w:anchor="_Toc242759064" w:history="1">
+      <w:hyperlink w:anchor="_Toc242898881" w:history="1">
         <w:r>
           <w:rPr>
             <w:rStyle w:val="Hipervnculo"/>
@@ -1444,7 +1436,7 @@
             <w:noProof/>
             <w:webHidden/>
           </w:rPr>
-          <w:instrText xml:space="preserve"> PAGEREF _Toc242759064 \h </w:instrText>
+          <w:instrText xml:space="preserve"> PAGEREF _Toc242898881 \h </w:instrText>
         </w:r>
         <w:r>
           <w:rPr>
@@ -1492,7 +1484,7 @@
           <w14:ligatures w14:val="standardContextual"/>
         </w:rPr>
       </w:pPr>
-      <w:hyperlink w:anchor="_Toc242759065" w:history="1">
+      <w:hyperlink w:anchor="_Toc242898882" w:history="1">
         <w:r>
           <w:rPr>
             <w:rStyle w:val="Hipervnculo"/>
@@ -1519,7 +1511,7 @@
             <w:noProof/>
             <w:webHidden/>
           </w:rPr>
-          <w:instrText xml:space="preserve"> PAGEREF _Toc242759065 \h </w:instrText>
+          <w:instrText xml:space="preserve"> PAGEREF _Toc242898882 \h </w:instrText>
         </w:r>
         <w:r>
           <w:rPr>
@@ -1567,7 +1559,7 @@
           <w14:ligatures w14:val="standardContextual"/>
         </w:rPr>
       </w:pPr>
-      <w:hyperlink w:anchor="_Toc242759066" w:history="1">
+      <w:hyperlink w:anchor="_Toc242898883" w:history="1">
         <w:r>
           <w:rPr>
             <w:rStyle w:val="Hipervnculo"/>
@@ -1594,7 +1586,7 @@
             <w:noProof/>
             <w:webHidden/>
           </w:rPr>
-          <w:instrText xml:space="preserve"> PAGEREF _Toc242759066 \h </w:instrText>
+          <w:instrText xml:space="preserve"> PAGEREF _Toc242898883 \h </w:instrText>
         </w:r>
         <w:r>
           <w:rPr>
@@ -1642,7 +1634,7 @@
           <w14:ligatures w14:val="standardContextual"/>
         </w:rPr>
       </w:pPr>
-      <w:hyperlink w:anchor="_Toc242759067" w:history="1">
+      <w:hyperlink w:anchor="_Toc242898884" w:history="1">
         <w:r>
           <w:rPr>
             <w:rStyle w:val="Hipervnculo"/>
@@ -1669,7 +1661,7 @@
             <w:noProof/>
             <w:webHidden/>
           </w:rPr>
-          <w:instrText xml:space="preserve"> PAGEREF _Toc242759067 \h </w:instrText>
+          <w:instrText xml:space="preserve"> PAGEREF _Toc242898884 \h </w:instrText>
         </w:r>
         <w:r>
           <w:rPr>
@@ -1717,7 +1709,7 @@
           <w14:ligatures w14:val="standardContextual"/>
         </w:rPr>
       </w:pPr>
-      <w:hyperlink w:anchor="_Toc242759068" w:history="1">
+      <w:hyperlink w:anchor="_Toc242898885" w:history="1">
         <w:r>
           <w:rPr>
             <w:rStyle w:val="Hipervnculo"/>
@@ -1744,7 +1736,7 @@
             <w:noProof/>
             <w:webHidden/>
           </w:rPr>
-          <w:instrText xml:space="preserve"> PAGEREF _Toc242759068 \h </w:instrText>
+          <w:instrText xml:space="preserve"> PAGEREF _Toc242898885 \h </w:instrText>
         </w:r>
         <w:r>
           <w:rPr>
@@ -1792,7 +1784,7 @@
           <w14:ligatures w14:val="standardContextual"/>
         </w:rPr>
       </w:pPr>
-      <w:hyperlink w:anchor="_Toc242759069" w:history="1">
+      <w:hyperlink w:anchor="_Toc242898886" w:history="1">
         <w:r>
           <w:rPr>
             <w:rStyle w:val="Hipervnculo"/>
@@ -1819,7 +1811,7 @@
             <w:noProof/>
             <w:webHidden/>
           </w:rPr>
-          <w:instrText xml:space="preserve"> PAGEREF _Toc242759069 \h </w:instrText>
+          <w:instrText xml:space="preserve"> PAGEREF _Toc242898886 \h </w:instrText>
         </w:r>
         <w:r>
           <w:rPr>
@@ -1867,7 +1859,7 @@
           <w14:ligatures w14:val="standardContextual"/>
         </w:rPr>
       </w:pPr>
-      <w:hyperlink w:anchor="_Toc242759070" w:history="1">
+      <w:hyperlink w:anchor="_Toc242898887" w:history="1">
         <w:r>
           <w:rPr>
             <w:rStyle w:val="Hipervnculo"/>
@@ -1894,7 +1886,7 @@
             <w:noProof/>
             <w:webHidden/>
           </w:rPr>
-          <w:instrText xml:space="preserve"> PAGEREF _Toc242759070 \h </w:instrText>
+          <w:instrText xml:space="preserve"> PAGEREF _Toc242898887 \h </w:instrText>
         </w:r>
         <w:r>
           <w:rPr>
@@ -1942,7 +1934,7 @@
           <w14:ligatures w14:val="standardContextual"/>
         </w:rPr>
       </w:pPr>
-      <w:hyperlink w:anchor="_Toc242759071" w:history="1">
+      <w:hyperlink w:anchor="_Toc242898888" w:history="1">
         <w:r>
           <w:rPr>
             <w:rStyle w:val="Hipervnculo"/>
@@ -1969,7 +1961,7 @@
             <w:noProof/>
             <w:webHidden/>
           </w:rPr>
-          <w:instrText xml:space="preserve"> PAGEREF _Toc242759071 \h </w:instrText>
+          <w:instrText xml:space="preserve"> PAGEREF _Toc242898888 \h </w:instrText>
         </w:r>
         <w:r>
           <w:rPr>
@@ -2017,7 +2009,7 @@
           <w14:ligatures w14:val="standardContextual"/>
         </w:rPr>
       </w:pPr>
-      <w:hyperlink w:anchor="_Toc242759072" w:history="1">
+      <w:hyperlink w:anchor="_Toc242898889" w:history="1">
         <w:r>
           <w:rPr>
             <w:rStyle w:val="Hipervnculo"/>
@@ -2044,7 +2036,7 @@
             <w:noProof/>
             <w:webHidden/>
           </w:rPr>
-          <w:instrText xml:space="preserve"> PAGEREF _Toc242759072 \h </w:instrText>
+          <w:instrText xml:space="preserve"> PAGEREF _Toc242898889 \h </w:instrText>
         </w:r>
         <w:r>
           <w:rPr>
@@ -2092,7 +2084,7 @@
           <w14:ligatures w14:val="standardContextual"/>
         </w:rPr>
       </w:pPr>
-      <w:hyperlink w:anchor="_Toc242759073" w:history="1">
+      <w:hyperlink w:anchor="_Toc242898890" w:history="1">
         <w:r>
           <w:rPr>
             <w:rStyle w:val="Hipervnculo"/>
@@ -2119,7 +2111,7 @@
             <w:noProof/>
             <w:webHidden/>
           </w:rPr>
-          <w:instrText xml:space="preserve"> PAGEREF _Toc242759073 \h </w:instrText>
+          <w:instrText xml:space="preserve"> PAGEREF _Toc242898890 \h </w:instrText>
         </w:r>
         <w:r>
           <w:rPr>
@@ -2164,7 +2156,7 @@
       <w:pPr>
         <w:pStyle w:val="Ttulo1"/>
       </w:pPr>
-      <w:bookmarkStart w:id="1" w:name="_Toc242759051"/>
+      <w:bookmarkStart w:id="1" w:name="_Toc242898868"/>
       <w:r>
         <w:lastRenderedPageBreak/>
         <w:t>1. Introducción</w:t>
@@ -2175,7 +2167,7 @@
       <w:pPr>
         <w:pStyle w:val="Ttulo2"/>
       </w:pPr>
-      <w:bookmarkStart w:id="2" w:name="_Toc242759052"/>
+      <w:bookmarkStart w:id="2" w:name="_Toc242898869"/>
       <w:r>
         <w:t>1.1 Objetivo del avance</w:t>
       </w:r>
@@ -2200,7 +2192,7 @@
       <w:pPr>
         <w:pStyle w:val="Ttulo2"/>
       </w:pPr>
-      <w:bookmarkStart w:id="3" w:name="_Toc242759053"/>
+      <w:bookmarkStart w:id="3" w:name="_Toc242898870"/>
       <w:r>
         <w:t>1.2 Estado del proyecto</w:t>
       </w:r>
@@ -2681,7 +2673,7 @@
       <w:pPr>
         <w:pStyle w:val="Ttulo2"/>
       </w:pPr>
-      <w:bookmarkStart w:id="4" w:name="_Toc242759054"/>
+      <w:bookmarkStart w:id="4" w:name="_Toc242898871"/>
       <w:r>
         <w:lastRenderedPageBreak/>
         <w:t>1.3 Tecnologías</w:t>
@@ -3163,7 +3155,7 @@
       <w:pPr>
         <w:pStyle w:val="Ttulo1"/>
       </w:pPr>
-      <w:bookmarkStart w:id="5" w:name="_Toc242759055"/>
+      <w:bookmarkStart w:id="5" w:name="_Toc242898872"/>
       <w:r>
         <w:lastRenderedPageBreak/>
         <w:t>2. Patrones de arquitectura aplicados</w:t>
@@ -3179,7 +3171,7 @@
       <w:pPr>
         <w:pStyle w:val="Ttulo2"/>
       </w:pPr>
-      <w:bookmarkStart w:id="6" w:name="_Toc242759056"/>
+      <w:bookmarkStart w:id="6" w:name="_Toc242898873"/>
       <w:r>
         <w:t>2.1 Arquitectura en capas</w:t>
       </w:r>
@@ -3522,7 +3514,7 @@
       <w:pPr>
         <w:pStyle w:val="Ttulo3"/>
       </w:pPr>
-      <w:bookmarkStart w:id="7" w:name="_Toc242759057"/>
+      <w:bookmarkStart w:id="7" w:name="_Toc242898874"/>
       <w:r>
         <w:t>2.1.1 El taller de Coral Shop en capas</w:t>
       </w:r>
@@ -3549,7 +3541,7 @@
         </w:rPr>
         <w:lastRenderedPageBreak/>
         <w:drawing>
-          <wp:inline distT="0" distB="0" distL="0" distR="0" wp14:anchorId="2599BF65" wp14:editId="16504EF9">
+          <wp:inline distT="0" distB="0" distL="0" distR="0" wp14:anchorId="3D899864" wp14:editId="62A81BBA">
             <wp:extent cx="5852160" cy="3160166"/>
             <wp:effectExtent l="0" t="0" r="0" b="0"/>
             <wp:docPr id="1" name="Picture 1"/>
@@ -3654,7 +3646,7 @@
       <w:pPr>
         <w:pStyle w:val="Ttulo3"/>
       </w:pPr>
-      <w:bookmarkStart w:id="8" w:name="_Toc242759058"/>
+      <w:bookmarkStart w:id="8" w:name="_Toc242898875"/>
       <w:r>
         <w:t>2.1.2 Caso práctico: crear el pedido de 12 polos bordados</w:t>
       </w:r>
@@ -3676,7 +3668,7 @@
         </w:rPr>
         <w:lastRenderedPageBreak/>
         <w:drawing>
-          <wp:inline distT="0" distB="0" distL="0" distR="0" wp14:anchorId="21F272A9" wp14:editId="6D258CD1">
+          <wp:inline distT="0" distB="0" distL="0" distR="0" wp14:anchorId="663CA1E2" wp14:editId="3F1B49D9">
             <wp:extent cx="5486400" cy="4059936"/>
             <wp:effectExtent l="0" t="0" r="0" b="0"/>
             <wp:docPr id="2" name="Picture 2"/>
@@ -3781,7 +3773,7 @@
       <w:pPr>
         <w:pStyle w:val="Ttulo3"/>
       </w:pPr>
-      <w:bookmarkStart w:id="9" w:name="_Toc242759059"/>
+      <w:bookmarkStart w:id="9" w:name="_Toc242898876"/>
       <w:r>
         <w:t>2.1.3 Respuestas de error uniformes</w:t>
       </w:r>
@@ -4100,7 +4092,7 @@
       <w:pPr>
         <w:pStyle w:val="Ttulo2"/>
       </w:pPr>
-      <w:bookmarkStart w:id="10" w:name="_Toc242759060"/>
+      <w:bookmarkStart w:id="10" w:name="_Toc242898877"/>
       <w:r>
         <w:t>2.2 Arquitectura cliente-servidor</w:t>
       </w:r>
@@ -4127,7 +4119,7 @@
         </w:rPr>
         <w:lastRenderedPageBreak/>
         <w:drawing>
-          <wp:inline distT="0" distB="0" distL="0" distR="0" wp14:anchorId="54981C72" wp14:editId="6A881841">
+          <wp:inline distT="0" distB="0" distL="0" distR="0" wp14:anchorId="14ECCF25" wp14:editId="5BD37297">
             <wp:extent cx="5852160" cy="3745382"/>
             <wp:effectExtent l="0" t="0" r="0" b="0"/>
             <wp:docPr id="3" name="Picture 3"/>
@@ -4594,7 +4586,7 @@
       <w:pPr>
         <w:pStyle w:val="Ttulo2"/>
       </w:pPr>
-      <w:bookmarkStart w:id="11" w:name="_Toc242759061"/>
+      <w:bookmarkStart w:id="11" w:name="_Toc242898878"/>
       <w:r>
         <w:t>2.3 Modelo-Vista-Controlador</w:t>
       </w:r>
@@ -4624,7 +4616,7 @@
           <w:noProof/>
         </w:rPr>
         <w:drawing>
-          <wp:inline distT="0" distB="0" distL="0" distR="0" wp14:anchorId="02176376" wp14:editId="564F6448">
+          <wp:inline distT="0" distB="0" distL="0" distR="0" wp14:anchorId="59DFF4E1" wp14:editId="7FC23666">
             <wp:extent cx="5852160" cy="3862426"/>
             <wp:effectExtent l="0" t="0" r="0" b="0"/>
             <wp:docPr id="4" name="Picture 4"/>
@@ -4938,7 +4930,7 @@
       <w:pPr>
         <w:pStyle w:val="Ttulo2"/>
       </w:pPr>
-      <w:bookmarkStart w:id="12" w:name="_Toc242759062"/>
+      <w:bookmarkStart w:id="12" w:name="_Toc242898879"/>
       <w:r>
         <w:t>2.4 Arquitectura dirigida por eventos</w:t>
       </w:r>
@@ -5015,7 +5007,7 @@
           <w:noProof/>
         </w:rPr>
         <w:drawing>
-          <wp:inline distT="0" distB="0" distL="0" distR="0" wp14:anchorId="3EC703C3" wp14:editId="73E82601">
+          <wp:inline distT="0" distB="0" distL="0" distR="0" wp14:anchorId="58ADDF04" wp14:editId="21516EF4">
             <wp:extent cx="5852160" cy="3979469"/>
             <wp:effectExtent l="0" t="0" r="0" b="0"/>
             <wp:docPr id="5" name="Picture 5"/>
@@ -5445,7 +5437,7 @@
       <w:pPr>
         <w:pStyle w:val="Ttulo2"/>
       </w:pPr>
-      <w:bookmarkStart w:id="13" w:name="_Toc242759063"/>
+      <w:bookmarkStart w:id="13" w:name="_Toc242898880"/>
       <w:r>
         <w:t>2.5 Cómo conviven los cuatro patrones</w:t>
       </w:r>
@@ -5855,7 +5847,7 @@
       <w:pPr>
         <w:pStyle w:val="Ttulo1"/>
       </w:pPr>
-      <w:bookmarkStart w:id="14" w:name="_Toc242759064"/>
+      <w:bookmarkStart w:id="14" w:name="_Toc242898881"/>
       <w:r>
         <w:lastRenderedPageBreak/>
         <w:t>3. Implementación del avance</w:t>
@@ -5866,7 +5858,7 @@
       <w:pPr>
         <w:pStyle w:val="Ttulo2"/>
       </w:pPr>
-      <w:bookmarkStart w:id="15" w:name="_Toc242759065"/>
+      <w:bookmarkStart w:id="15" w:name="_Toc242898882"/>
       <w:r>
         <w:t>3.1 Estructura de paquetes</w:t>
       </w:r>
@@ -6088,7 +6080,7 @@
       <w:pPr>
         <w:pStyle w:val="Ttulo2"/>
       </w:pPr>
-      <w:bookmarkStart w:id="16" w:name="_Toc242759066"/>
+      <w:bookmarkStart w:id="16" w:name="_Toc242898883"/>
       <w:r>
         <w:t>3.2 Pantallas implementadas</w:t>
       </w:r>
@@ -6620,7 +6612,7 @@
       <w:pPr>
         <w:pStyle w:val="Ttulo2"/>
       </w:pPr>
-      <w:bookmarkStart w:id="17" w:name="_Toc242759067"/>
+      <w:bookmarkStart w:id="17" w:name="_Toc242898884"/>
       <w:r>
         <w:t>3.3 Endpoints implementados</w:t>
       </w:r>
@@ -7424,7 +7416,7 @@
       <w:pPr>
         <w:pStyle w:val="Ttulo2"/>
       </w:pPr>
-      <w:bookmarkStart w:id="18" w:name="_Toc242759068"/>
+      <w:bookmarkStart w:id="18" w:name="_Toc242898885"/>
       <w:r>
         <w:t>3.4 Reglas de negocio implementadas</w:t>
       </w:r>
@@ -7532,7 +7524,7 @@
       <w:pPr>
         <w:pStyle w:val="Ttulo2"/>
       </w:pPr>
-      <w:bookmarkStart w:id="19" w:name="_Toc242759069"/>
+      <w:bookmarkStart w:id="19" w:name="_Toc242898886"/>
       <w:r>
         <w:lastRenderedPageBreak/>
         <w:t>3.5 Modelo de datos</w:t>
@@ -7565,7 +7557,7 @@
         </w:rPr>
         <w:lastRenderedPageBreak/>
         <w:drawing>
-          <wp:inline distT="0" distB="0" distL="0" distR="0" wp14:anchorId="2C06F039" wp14:editId="213A77ED">
+          <wp:inline distT="0" distB="0" distL="0" distR="0" wp14:anchorId="4C1A3997" wp14:editId="2520437A">
             <wp:extent cx="8229600" cy="4349931"/>
             <wp:effectExtent l="0" t="0" r="0" b="0"/>
             <wp:docPr id="6" name="Picture 6"/>
@@ -7629,7 +7621,7 @@
       <w:pPr>
         <w:pStyle w:val="Ttulo2"/>
       </w:pPr>
-      <w:bookmarkStart w:id="20" w:name="_Toc242759070"/>
+      <w:bookmarkStart w:id="20" w:name="_Toc242898887"/>
       <w:r>
         <w:lastRenderedPageBreak/>
         <w:t>3.6 Pruebas y verificación</w:t>
@@ -8002,7 +7994,7 @@
       <w:pPr>
         <w:pStyle w:val="Ttulo1"/>
       </w:pPr>
-      <w:bookmarkStart w:id="21" w:name="_Toc242759071"/>
+      <w:bookmarkStart w:id="21" w:name="_Toc242898888"/>
       <w:r>
         <w:lastRenderedPageBreak/>
         <w:t>4. Próximos pasos</w:t>
@@ -8062,7 +8054,7 @@
         <w:t>Fase 5 · Documentación.</w:t>
       </w:r>
       <w:r>
-        <w:t xml:space="preserve"> Informe y presentación finales con capturas reales de las pantallas y reparto de la exposición entre los cinco integrantes.</w:t>
+        <w:t xml:space="preserve"> Informe y presentación finales con capturas reales de las pantallas y reparto de la exposición entre los cuatro integrantes.</w:t>
       </w:r>
     </w:p>
     <w:p>
@@ -8083,7 +8075,7 @@
       <w:pPr>
         <w:pStyle w:val="Ttulo1"/>
       </w:pPr>
-      <w:bookmarkStart w:id="22" w:name="_Toc242759072"/>
+      <w:bookmarkStart w:id="22" w:name="_Toc242898889"/>
       <w:r>
         <w:t>5. Conclusiones</w:t>
       </w:r>
@@ -8138,7 +8130,7 @@
       <w:pPr>
         <w:pStyle w:val="Ttulo1"/>
       </w:pPr>
-      <w:bookmarkStart w:id="23" w:name="_Toc242759073"/>
+      <w:bookmarkStart w:id="23" w:name="_Toc242898890"/>
       <w:r>
         <w:lastRenderedPageBreak/>
         <w:t>Anexo A. Diagramas entidad-relación</w:t>
@@ -8171,7 +8163,7 @@
         </w:rPr>
         <w:lastRenderedPageBreak/>
         <w:drawing>
-          <wp:inline distT="0" distB="0" distL="0" distR="0" wp14:anchorId="5B1781EF" wp14:editId="2FE08890">
+          <wp:inline distT="0" distB="0" distL="0" distR="0" wp14:anchorId="61C96F31" wp14:editId="07BB9CC5">
             <wp:extent cx="8229600" cy="4389120"/>
             <wp:effectExtent l="0" t="0" r="0" b="0"/>
             <wp:docPr id="7" name="Picture 7"/>
@@ -8237,7 +8229,7 @@
         </w:rPr>
         <w:lastRenderedPageBreak/>
         <w:drawing>
-          <wp:inline distT="0" distB="0" distL="0" distR="0" wp14:anchorId="53E3D4E0" wp14:editId="666A8A09">
+          <wp:inline distT="0" distB="0" distL="0" distR="0" wp14:anchorId="4379EF9B" wp14:editId="37E9F66F">
             <wp:extent cx="8229600" cy="5486400"/>
             <wp:effectExtent l="0" t="0" r="0" b="0"/>
             <wp:docPr id="8" name="Picture 8"/>
@@ -8470,31 +8462,31 @@
       </w:rPr>
     </w:lvl>
   </w:abstractNum>
-  <w:num w:numId="1" w16cid:durableId="433792121">
+  <w:num w:numId="1" w16cid:durableId="969290168">
     <w:abstractNumId w:val="8"/>
   </w:num>
-  <w:num w:numId="2" w16cid:durableId="664480177">
+  <w:num w:numId="2" w16cid:durableId="334304277">
     <w:abstractNumId w:val="6"/>
   </w:num>
-  <w:num w:numId="3" w16cid:durableId="1853908973">
+  <w:num w:numId="3" w16cid:durableId="825436463">
     <w:abstractNumId w:val="5"/>
   </w:num>
-  <w:num w:numId="4" w16cid:durableId="1487474134">
+  <w:num w:numId="4" w16cid:durableId="1863783349">
     <w:abstractNumId w:val="4"/>
   </w:num>
-  <w:num w:numId="5" w16cid:durableId="979920403">
+  <w:num w:numId="5" w16cid:durableId="1867938964">
     <w:abstractNumId w:val="7"/>
   </w:num>
-  <w:num w:numId="6" w16cid:durableId="1748113780">
+  <w:num w:numId="6" w16cid:durableId="1479297592">
     <w:abstractNumId w:val="3"/>
   </w:num>
-  <w:num w:numId="7" w16cid:durableId="37124079">
+  <w:num w:numId="7" w16cid:durableId="1567569071">
     <w:abstractNumId w:val="2"/>
   </w:num>
-  <w:num w:numId="8" w16cid:durableId="989208474">
+  <w:num w:numId="8" w16cid:durableId="16591294">
     <w:abstractNumId w:val="1"/>
   </w:num>
-  <w:num w:numId="9" w16cid:durableId="391202242">
+  <w:num w:numId="9" w16cid:durableId="1363941647">
     <w:abstractNumId w:val="0"/>
   </w:num>
 </w:numbering>
@@ -19889,7 +19881,7 @@
     <w:autoRedefine/>
     <w:uiPriority w:val="39"/>
     <w:unhideWhenUsed/>
-    <w:rsid w:val="00867F7B"/>
+    <w:rsid w:val="00AA1EE9"/>
     <w:pPr>
       <w:spacing w:after="100"/>
     </w:pPr>
@@ -19901,7 +19893,7 @@
     <w:autoRedefine/>
     <w:uiPriority w:val="39"/>
     <w:unhideWhenUsed/>
-    <w:rsid w:val="00867F7B"/>
+    <w:rsid w:val="00AA1EE9"/>
     <w:pPr>
       <w:spacing w:after="100"/>
       <w:ind w:left="220"/>
@@ -19914,7 +19906,7 @@
     <w:autoRedefine/>
     <w:uiPriority w:val="39"/>
     <w:unhideWhenUsed/>
-    <w:rsid w:val="00867F7B"/>
+    <w:rsid w:val="00AA1EE9"/>
     <w:pPr>
       <w:spacing w:after="100"/>
       <w:ind w:left="440"/>
@@ -19925,7 +19917,7 @@
     <w:basedOn w:val="Fuentedeprrafopredeter"/>
     <w:uiPriority w:val="99"/>
     <w:unhideWhenUsed/>
-    <w:rsid w:val="00867F7B"/>
+    <w:rsid w:val="00AA1EE9"/>
     <w:rPr>
       <w:color w:val="0000FF" w:themeColor="hyperlink"/>
       <w:u w:val="single"/>

</xml_diff>